<commit_message>
v0.10l: add §3.20 reforestation potential application (v3.0.0 unmasked surface use case)
</commit_message>
<xml_diff>
--- a/manuscript/CSPI_v0_10l_FEM_combined.docx
+++ b/manuscript/CSPI_v0_10l_FEM_combined.docx
@@ -2,7 +2,7 @@
 <file path=word/document.xml><?xml version="1.0" encoding="utf-8"?>
 <w:document xmlns:w="http://schemas.openxmlformats.org/wordprocessingml/2006/main" xmlns:m="http://schemas.openxmlformats.org/officeDocument/2006/math" xmlns:r="http://schemas.openxmlformats.org/officeDocument/2006/relationships" xmlns:o="urn:schemas-microsoft-com:office:office" xmlns:v="urn:schemas-microsoft-com:vml" xmlns:w10="urn:schemas-microsoft-com:office:word" xmlns:a="http://schemas.openxmlformats.org/drawingml/2006/main" xmlns:pic="http://schemas.openxmlformats.org/drawingml/2006/picture" xmlns:wp="http://schemas.openxmlformats.org/drawingml/2006/wordprocessingDrawing">
   <w:body>
-    <w:bookmarkStart w:id="57" w:name="X722bb134dbfc670aa2888153d48a0977f604ac1"/>
+    <w:bookmarkStart w:id="58" w:name="X722bb134dbfc670aa2888153d48a0977f604ac1"/>
     <w:p>
       <w:pPr>
         <w:pStyle w:val="Heading1"/>
@@ -6092,7 +6092,7 @@
     </w:p>
     <w:bookmarkEnd w:id="31"/>
     <w:bookmarkEnd w:id="32"/>
-    <w:bookmarkStart w:id="49" w:name="discussion"/>
+    <w:bookmarkStart w:id="50" w:name="discussion"/>
     <w:p>
       <w:pPr>
         <w:pStyle w:val="Heading2"/>
@@ -12117,12 +12117,38 @@
       </w:r>
     </w:p>
     <w:bookmarkEnd w:id="45"/>
-    <w:bookmarkStart w:id="46" w:name="what-is-robust-to-the-sicond-correction"/>
+    <w:bookmarkStart w:id="46" w:name="reforestation-potential-application"/>
     <w:p>
       <w:pPr>
         <w:pStyle w:val="Heading3"/>
       </w:pPr>
       <w:r>
+        <w:t xml:space="preserve">3.20 Reforestation potential application</w:t>
+      </w:r>
+    </w:p>
+    <w:p>
+      <w:pPr>
+        <w:pStyle w:val="FirstParagraph"/>
+      </w:pPr>
+      <w:r>
+        <w:t xml:space="preserve">The v3.0.0 release ships both forest-masked and unmasked versions of the Asym v9 surface (NEWS_v3.0.0.md). Pixels currently classified as non-forest in the Hansen 2000 tree-cover layer carry a model-estimated potential mature carrying capacity that represents what the surface would predict if a closed-canopy forest stand were to develop at that location given its local soil, terrain, climate, and parent material. This is exactly the type of layer reforestation planners require to identify high-potential-storage candidates beyond the current forest footprint.</w:t>
+      </w:r>
+    </w:p>
+    <w:p>
+      <w:pPr>
+        <w:pStyle w:val="BodyText"/>
+      </w:pPr>
+      <w:r>
+        <w:t xml:space="preserve">The unmasked surface is intentionally provided as a planning-grade input, not a guaranteed-attainment layer: model-estimated asymptotic biomass at a current non-forest pixel reflects environmental suitability for mature forest carbon storage but does not address whether forest establishment is feasible (current land use, ownership, hydrology, fire regime, climate change trajectory). Combined with land-cover layers that filter for currently unforested but plausibly reforestable land (abandoned cropland, low-intensity pasture, post-disturbance non-forest pixels in formerly forested ecoregions), the v3.0.0 unmasked surface allows continental-scale reforestation potential ranking at 30 m resolution. Local-scale screening should overlay protected status, water table depth, ownership patterns, and stakeholder priorities before any specific site is acted on. We expect the most informative future use of the unmasked surface will be paired with NLCD land-cover transitions and county-scale agricultural retirement datasets, neither of which are derived here. CONUS-scale pixel counts and aggregate carbon storage potential summaries from the unmasked surface will be tabulated in v3.0.1 once the underlying compute completes.</w:t>
+      </w:r>
+    </w:p>
+    <w:bookmarkEnd w:id="46"/>
+    <w:bookmarkStart w:id="47" w:name="what-is-robust-to-the-sicond-correction"/>
+    <w:p>
+      <w:pPr>
+        <w:pStyle w:val="Heading3"/>
+      </w:pPr>
+      <w:r>
         <w:t xml:space="preserve">4.7 What is robust to the SICOND correction</w:t>
       </w:r>
     </w:p>
@@ -12174,8 +12200,8 @@
         <w:t xml:space="preserve">What changed in the corrected reading is the specific claim about SICOND. The base-age-corrected SICOND × ESI correlation is +0.48, not −0.08; the SSURGO comparator (Table 2b) and the GADA-refit comparator (Table 2c) both show that traditional measurement chains share substantial structure with the unified-target ESI rather than being orthogonal to it. The structural argument for the multi-dimensional view does not rest on SICOND-ESI orthogonality; it rests on the four-dimensional cross-prediction analysis, the SITECLCD random forest, and the stand-age and species heterogeneity. The SICOND base-age finding is now a robustness-check section, not a headline.</w:t>
       </w:r>
     </w:p>
-    <w:bookmarkEnd w:id="46"/>
-    <w:bookmarkStart w:id="47" w:name="X9e4293d70d9e0bafbc2e5517d8b565b24cce7fd"/>
+    <w:bookmarkEnd w:id="47"/>
+    <w:bookmarkStart w:id="48" w:name="X9e4293d70d9e0bafbc2e5517d8b565b24cce7fd"/>
     <w:p>
       <w:pPr>
         <w:pStyle w:val="Heading3"/>
@@ -12208,8 +12234,8 @@
         <w:t xml:space="preserve">An independent prediction validation would require: (a) long-term carbon-sequestration rates from non-FIA permanent forest research plots (e.g., USFS Long-Term Ecological Research network plots), (b) net primary production at AmeriFlux tower sites, or (c) commercial growth-and-yield records from intensively managed plantations with calibrated yield curves. Such validation is planned for the v3.0.0 release cycle.</w:t>
       </w:r>
     </w:p>
-    <w:bookmarkEnd w:id="47"/>
-    <w:bookmarkStart w:id="48" w:name="limitations"/>
+    <w:bookmarkEnd w:id="48"/>
+    <w:bookmarkStart w:id="49" w:name="limitations"/>
     <w:p>
       <w:pPr>
         <w:pStyle w:val="Heading3"/>
@@ -12242,9 +12268,9 @@
         <w:t xml:space="preserve">The unified North America site index compilation that supplies the ESI training response is described in a companion methods note (Weiskittel et al., in preparation). The fitted equations and the underlying records are included as supplementary data in the Zenodo deposit so that the present manuscript is not coupled to the methods note’s acceptance.</w:t>
       </w:r>
     </w:p>
-    <w:bookmarkEnd w:id="48"/>
     <w:bookmarkEnd w:id="49"/>
-    <w:bookmarkStart w:id="50" w:name="conclusions"/>
+    <w:bookmarkEnd w:id="50"/>
+    <w:bookmarkStart w:id="51" w:name="conclusions"/>
     <w:p>
       <w:pPr>
         <w:pStyle w:val="Heading2"/>
@@ -12277,8 +12303,8 @@
         <w:t xml:space="preserve">We release the 3-component CSPI v2 composite at 30 m as the operational implementation of the multi-dimensional view, together with the four component layers, the parent material 30 m overlay, and a parent-material-aware corrective surface for asymptotic biomass (Asym v9). All five products are deposited under Zenodo concept DOI 10.5281/zenodo.20515034 with versions 2.0.0 at 10.5281/zenodo.20663652 and v3.0.0 in preparation as this paper goes to press. Users who need a single productivity layer can take the CSPI v2 composite; users who need to decompose by productivity dimension can take the component layers; users whose application is concentrated in geologically distinctive regions can take the parent material overlay and the Asym v9 corrective surface together. The multi-dimensional reading is meant to give the operational community a richer toolkit, not to displace the FIA SICOND/SITECLCD infrastructure on which seven decades of forest assessment depend.</w:t>
       </w:r>
     </w:p>
-    <w:bookmarkEnd w:id="50"/>
-    <w:bookmarkStart w:id="51" w:name="author-contributions-credit"/>
+    <w:bookmarkEnd w:id="51"/>
+    <w:bookmarkStart w:id="52" w:name="author-contributions-credit"/>
     <w:p>
       <w:pPr>
         <w:pStyle w:val="Heading2"/>
@@ -12295,8 +12321,8 @@
         <w:t xml:space="preserve">Aaron R. Weiskittel: Conceptualization, Methodology, Software, Validation, Formal analysis, Investigation, Resources, Data curation, Writing — original draft, Writing — review and editing, Visualization, Supervision, Project administration, Funding acquisition.</w:t>
       </w:r>
     </w:p>
-    <w:bookmarkEnd w:id="51"/>
-    <w:bookmarkStart w:id="52" w:name="declaration-of-competing-interests"/>
+    <w:bookmarkEnd w:id="52"/>
+    <w:bookmarkStart w:id="53" w:name="declaration-of-competing-interests"/>
     <w:p>
       <w:pPr>
         <w:pStyle w:val="Heading2"/>
@@ -12313,8 +12339,8 @@
         <w:t xml:space="preserve">The author declares no competing interests.</w:t>
       </w:r>
     </w:p>
-    <w:bookmarkEnd w:id="52"/>
-    <w:bookmarkStart w:id="53" w:name="declaration-of-generative-ai-use"/>
+    <w:bookmarkEnd w:id="53"/>
+    <w:bookmarkStart w:id="54" w:name="declaration-of-generative-ai-use"/>
     <w:p>
       <w:pPr>
         <w:pStyle w:val="Heading2"/>
@@ -12331,8 +12357,8 @@
         <w:t xml:space="preserve">During the preparation of this work the author used Claude (Anthropic) for structural organization, consistency checking, and code drafting in the analytical pipeline. The author reviewed and edited all output and takes full responsibility for the content of the publication.</w:t>
       </w:r>
     </w:p>
-    <w:bookmarkEnd w:id="53"/>
-    <w:bookmarkStart w:id="54" w:name="acknowledgments"/>
+    <w:bookmarkEnd w:id="54"/>
+    <w:bookmarkStart w:id="55" w:name="acknowledgments"/>
     <w:p>
       <w:pPr>
         <w:pStyle w:val="Heading2"/>
@@ -12349,8 +12375,8 @@
         <w:t xml:space="preserve">This work was supported by the University of Maine Center for Research on Sustainable Forests. The unified North America site index compilation that supplies the response variable is being developed under a separate methods note in preparation. Computation was performed on the Ohio Supercomputer Center Cardinal cluster under allocation PUOM0008.</w:t>
       </w:r>
     </w:p>
-    <w:bookmarkEnd w:id="54"/>
-    <w:bookmarkStart w:id="55" w:name="data-and-code-availability"/>
+    <w:bookmarkEnd w:id="55"/>
+    <w:bookmarkStart w:id="56" w:name="data-and-code-availability"/>
     <w:p>
       <w:pPr>
         <w:pStyle w:val="Heading2"/>
@@ -12409,8 +12435,8 @@
         <w:t xml:space="preserve">) for reproducibility, and release notes. v2.0.0 (10.5281/zenodo.20663652) remains available and contains the 1 km ESI v6 surface and MOD17A3HGF NPP at 500 m; the SICOND-target v3 and v4 surfaces from v1.0.0 (10.5281/zenodo.20515035) also remain available. Pipeline at https://github.com/holoros/cspi-conus. Analytical chain archive at https://doi.org/10.5281/zenodo.20693106.</w:t>
       </w:r>
     </w:p>
-    <w:bookmarkEnd w:id="55"/>
-    <w:bookmarkStart w:id="56" w:name="references"/>
+    <w:bookmarkEnd w:id="56"/>
+    <w:bookmarkStart w:id="57" w:name="references"/>
     <w:p>
       <w:pPr>
         <w:pStyle w:val="Heading2"/>
@@ -12531,8 +12557,8 @@
         <w:t xml:space="preserve">Weiskittel, A. R. et al. (in preparation). The unified North America site index compilation.</w:t>
       </w:r>
     </w:p>
-    <w:bookmarkEnd w:id="56"/>
     <w:bookmarkEnd w:id="57"/>
+    <w:bookmarkEnd w:id="58"/>
     <w:sectPr>
       <w:footnotePr>
         <w:numRestart w:val="eachSect"/>

</xml_diff>